<commit_message>
feature: add email template and remove tests departmans
</commit_message>
<xml_diff>
--- a/src/letter.docx
+++ b/src/letter.docx
@@ -663,27 +663,7 @@
           <w:sz w:val="24"/>
           <w:szCs w:val="24"/>
         </w:rPr>
-        <w:t xml:space="preserve">Program: </w:t>
-      </w:r>
-      <w:r>
-        <w:rPr>
-          <w:rFonts w:cs="Times New Roman" w:ascii="Times New Roman" w:hAnsi="Times New Roman" w:asciiTheme="majorBidi" w:cstheme="majorBidi" w:hAnsiTheme="majorBidi"/>
-          <w:b/>
-          <w:bCs/>
-          <w:sz w:val="26"/>
-          <w:szCs w:val="26"/>
-        </w:rPr>
-        <w:t xml:space="preserve">&lt;&lt;faculty&gt;&gt; - </w:t>
-      </w:r>
-      <w:r>
-        <w:rPr>
-          <w:rFonts w:cs="Times New Roman" w:ascii="Times New Roman" w:hAnsi="Times New Roman" w:asciiTheme="majorBidi" w:cstheme="majorBidi" w:hAnsiTheme="majorBidi"/>
-          <w:b/>
-          <w:bCs/>
-          <w:sz w:val="24"/>
-          <w:szCs w:val="24"/>
-        </w:rPr>
-        <w:t>&lt;&lt;field_of_study&gt;&gt;</w:t>
+        <w:t>Program: &lt;&lt;field_of_study&gt;&gt;</w:t>
       </w:r>
     </w:p>
     <w:p>

</xml_diff>